<commit_message>
Last changes to CUBE documentation and ZSight
</commit_message>
<xml_diff>
--- a/2026/CUBE/Laravel Upgrade Strategy/DigDev_Cube_Laravel_Upgrade_Strategy_v1.0.docx
+++ b/2026/CUBE/Laravel Upgrade Strategy/DigDev_Cube_Laravel_Upgrade_Strategy_v1.0.docx
@@ -150,21 +150,12 @@
                 <w:szCs w:val="20"/>
               </w:rPr>
             </w:pPr>
-            <w:proofErr w:type="spellStart"/>
-            <w:r>
-              <w:rPr>
-                <w:sz w:val="20"/>
-                <w:szCs w:val="20"/>
-              </w:rPr>
-              <w:t>DigDev_Cube_Laravel_Upgrade_Strategy</w:t>
-            </w:r>
-            <w:proofErr w:type="spellEnd"/>
-            <w:r>
-              <w:rPr>
-                <w:sz w:val="20"/>
-                <w:szCs w:val="20"/>
-              </w:rPr>
-              <w:t>_(Policy)_v1.0</w:t>
+            <w:r>
+              <w:rPr>
+                <w:sz w:val="20"/>
+                <w:szCs w:val="20"/>
+              </w:rPr>
+              <w:t>DigDev_Cube_Laravel_Upgrade_Strategy_(Policy)_v1.0</w:t>
             </w:r>
           </w:p>
         </w:tc>
@@ -3366,14 +3357,7 @@
                 <w:sz w:val="20"/>
                 <w:szCs w:val="20"/>
               </w:rPr>
-              <w:t>0</w:t>
-            </w:r>
-            <w:r>
-              <w:rPr>
-                <w:sz w:val="20"/>
-                <w:szCs w:val="20"/>
-              </w:rPr>
-              <w:t>1</w:t>
+              <w:t>01</w:t>
             </w:r>
             <w:r>
               <w:rPr>
@@ -3387,14 +3371,7 @@
                 <w:sz w:val="20"/>
                 <w:szCs w:val="20"/>
               </w:rPr>
-              <w:t>0</w:t>
-            </w:r>
-            <w:r>
-              <w:rPr>
-                <w:sz w:val="20"/>
-                <w:szCs w:val="20"/>
-              </w:rPr>
-              <w:t>5</w:t>
+              <w:t>05</w:t>
             </w:r>
             <w:r>
               <w:rPr>
@@ -4575,24 +4552,8 @@
                 <w:sz w:val="20"/>
                 <w:szCs w:val="20"/>
               </w:rPr>
-              <w:t>Development T</w:t>
-            </w:r>
-            <w:r>
-              <w:rPr>
-                <w:sz w:val="20"/>
-                <w:szCs w:val="20"/>
-              </w:rPr>
-              <w:t xml:space="preserve"> </w:t>
-            </w:r>
-            <w:proofErr w:type="spellStart"/>
-            <w:r>
-              <w:rPr>
-                <w:sz w:val="20"/>
-                <w:szCs w:val="20"/>
-              </w:rPr>
-              <w:t>eam</w:t>
-            </w:r>
-            <w:proofErr w:type="spellEnd"/>
+              <w:t>Development Team</w:t>
+            </w:r>
           </w:p>
         </w:tc>
         <w:tc>
@@ -5163,23 +5124,7 @@
                 <w:sz w:val="20"/>
                 <w:szCs w:val="20"/>
               </w:rPr>
-              <w:t xml:space="preserve">The dependency manager </w:t>
-            </w:r>
-            <w:proofErr w:type="gramStart"/>
-            <w:r>
-              <w:rPr>
-                <w:sz w:val="20"/>
-                <w:szCs w:val="20"/>
-              </w:rPr>
-              <w:t>used by</w:t>
-            </w:r>
-            <w:proofErr w:type="gramEnd"/>
-            <w:r>
-              <w:rPr>
-                <w:sz w:val="20"/>
-                <w:szCs w:val="20"/>
-              </w:rPr>
-              <w:t xml:space="preserve"> Laravel/PHP applications to manage packages and framework dependencies.</w:t>
+              <w:t>The dependency manager used by Laravel/PHP applications to manage packages and framework dependencies.</w:t>
             </w:r>
           </w:p>
         </w:tc>
@@ -5305,23 +5250,7 @@
                 <w:sz w:val="20"/>
                 <w:szCs w:val="20"/>
               </w:rPr>
-              <w:t xml:space="preserve">An </w:t>
-            </w:r>
-            <w:proofErr w:type="gramStart"/>
-            <w:r>
-              <w:rPr>
-                <w:sz w:val="20"/>
-                <w:szCs w:val="20"/>
-              </w:rPr>
-              <w:t>upgrade</w:t>
-            </w:r>
-            <w:proofErr w:type="gramEnd"/>
-            <w:r>
-              <w:rPr>
-                <w:sz w:val="20"/>
-                <w:szCs w:val="20"/>
-              </w:rPr>
-              <w:t xml:space="preserve"> approach where Laravel services are updated incrementally instead of upgrading the entire system at once.</w:t>
+              <w:t>An upgrade approach where Laravel services are updated incrementally instead of upgrading the entire system at once.</w:t>
             </w:r>
           </w:p>
         </w:tc>
@@ -5489,23 +5418,7 @@
                 <w:sz w:val="20"/>
                 <w:szCs w:val="20"/>
               </w:rPr>
-              <w:t xml:space="preserve">A small, focused commit that contains one clear change, making </w:t>
-            </w:r>
-            <w:proofErr w:type="gramStart"/>
-            <w:r>
-              <w:rPr>
-                <w:sz w:val="20"/>
-                <w:szCs w:val="20"/>
-              </w:rPr>
-              <w:t>upgrade</w:t>
-            </w:r>
-            <w:proofErr w:type="gramEnd"/>
-            <w:r>
-              <w:rPr>
-                <w:sz w:val="20"/>
-                <w:szCs w:val="20"/>
-              </w:rPr>
-              <w:t xml:space="preserve"> work easier to review and understand.</w:t>
+              <w:t>A small, focused commit that contains one clear change, making upgrade work easier to review and understand.</w:t>
             </w:r>
           </w:p>
         </w:tc>
@@ -5997,13 +5910,8 @@
           <w:numId w:val="9"/>
         </w:numPr>
       </w:pPr>
-      <w:proofErr w:type="gramStart"/>
-      <w:r>
-        <w:t>Runs</w:t>
-      </w:r>
-      <w:proofErr w:type="gramEnd"/>
-      <w:r>
-        <w:t xml:space="preserve"> locally.</w:t>
+      <w:r>
+        <w:t>Runs locally.</w:t>
       </w:r>
     </w:p>
     <w:p>
@@ -6257,17 +6165,7 @@
         <w:spacing w:line="278" w:lineRule="auto"/>
       </w:pPr>
       <w:r>
-        <w:t xml:space="preserve">Laravel Shift clones the repository, updates </w:t>
-      </w:r>
-      <w:proofErr w:type="spellStart"/>
-      <w:proofErr w:type="gramStart"/>
-      <w:r>
-        <w:t>composer.json</w:t>
-      </w:r>
-      <w:proofErr w:type="spellEnd"/>
-      <w:proofErr w:type="gramEnd"/>
-      <w:r>
-        <w:t>, bumps first-party and popular community packages, and applies code changes based on the conventions of the target Laravel version.</w:t>
+        <w:t>Laravel Shift clones the repository, updates composer.json, bumps first-party and popular community packages, and applies code changes based on the conventions of the target Laravel version.</w:t>
       </w:r>
     </w:p>
     <w:p>
@@ -6492,6 +6390,9 @@
     </w:p>
     <w:p>
       <w:r>
+        <w:rPr>
+          <w:noProof/>
+        </w:rPr>
         <w:drawing>
           <wp:inline distT="0" distB="0" distL="0" distR="0" wp14:anchorId="1A0EDB1A" wp14:editId="46F835A2">
             <wp:extent cx="5624047" cy="6149873"/>
@@ -7561,8 +7462,6 @@
           <w:numId w:val="22"/>
         </w:numPr>
       </w:pPr>
-      <w:proofErr w:type="spellStart"/>
-      <w:proofErr w:type="gramStart"/>
       <w:r>
         <w:rPr>
           <w:rFonts w:ascii="Consolas" w:hAnsi="Consolas"/>
@@ -7570,8 +7469,6 @@
         </w:rPr>
         <w:t>composer.json</w:t>
       </w:r>
-      <w:proofErr w:type="spellEnd"/>
-      <w:proofErr w:type="gramEnd"/>
       <w:r>
         <w:t xml:space="preserve"> changes are understood.</w:t>
       </w:r>
@@ -7649,13 +7546,7 @@
     </w:p>
     <w:p>
       <w:r>
-        <w:t>Each upgraded service must be validated before approval.</w:t>
-      </w:r>
-      <w:r>
-        <w:t xml:space="preserve"> </w:t>
-      </w:r>
-      <w:r>
-        <w:t>Validation should include, where applicable:</w:t>
+        <w:t>Each upgraded service must be validated before approval. Validation should include, where applicable:</w:t>
       </w:r>
     </w:p>
     <w:p>
@@ -7756,23 +7647,7 @@
     </w:p>
     <w:p>
       <w:r>
-        <w:t xml:space="preserve">The </w:t>
-      </w:r>
-      <w:proofErr w:type="gramStart"/>
-      <w:r>
-        <w:t>upgrade</w:t>
-      </w:r>
-      <w:proofErr w:type="gramEnd"/>
-      <w:r>
-        <w:t xml:space="preserve"> branch may only be merged after review and validation </w:t>
-      </w:r>
-      <w:proofErr w:type="gramStart"/>
-      <w:r>
-        <w:t>are</w:t>
-      </w:r>
-      <w:proofErr w:type="gramEnd"/>
-      <w:r>
-        <w:t xml:space="preserve"> completed.</w:t>
+        <w:t>The upgrade branch may only be merged after review and validation are completed.</w:t>
       </w:r>
     </w:p>
     <w:p>
@@ -7793,13 +7668,7 @@
     </w:p>
     <w:p>
       <w:r>
-        <w:t>Each Laravel upgrade must include a rollback plan before deployment.</w:t>
-      </w:r>
-      <w:r>
-        <w:t xml:space="preserve"> </w:t>
-      </w:r>
-      <w:r>
-        <w:t>The rollback plan should define:</w:t>
+        <w:t>Each Laravel upgrade must include a rollback plan before deployment. The rollback plan should define:</w:t>
       </w:r>
     </w:p>
     <w:p>
@@ -7859,15 +7728,7 @@
         </w:numPr>
       </w:pPr>
       <w:r>
-        <w:t xml:space="preserve">The criteria for deciding when </w:t>
-      </w:r>
-      <w:proofErr w:type="gramStart"/>
-      <w:r>
-        <w:t>rollback</w:t>
-      </w:r>
-      <w:proofErr w:type="gramEnd"/>
-      <w:r>
-        <w:t xml:space="preserve"> is required.</w:t>
+        <w:t>The criteria for deciding when rollback is required.</w:t>
       </w:r>
     </w:p>
     <w:p>
@@ -7948,18 +7809,7 @@
     </w:p>
     <w:p>
       <w:r>
-        <w:t>To prevent future version drift, Laravel upgrade controls should be added to the development and CI process.</w:t>
-      </w:r>
-      <w:r>
-        <w:t xml:space="preserve"> </w:t>
-      </w:r>
-      <w:proofErr w:type="gramStart"/>
-      <w:r>
-        <w:t>Recommended</w:t>
-      </w:r>
-      <w:proofErr w:type="gramEnd"/>
-      <w:r>
-        <w:t xml:space="preserve"> controls include:</w:t>
+        <w:t>To prevent future version drift, Laravel upgrade controls should be added to the development and CI process. Recommended controls include:</w:t>
       </w:r>
     </w:p>
     <w:p>
@@ -8073,15 +7923,7 @@
         </w:rPr>
       </w:pPr>
       <w:r>
-        <w:t xml:space="preserve">Digital signature blocks below are formatted for </w:t>
-      </w:r>
-      <w:proofErr w:type="spellStart"/>
-      <w:r>
-        <w:t>DocuSign</w:t>
-      </w:r>
-      <w:proofErr w:type="spellEnd"/>
-      <w:r>
-        <w:t xml:space="preserve"> / Adobe Sign.</w:t>
+        <w:t>Digital signature blocks below are formatted for DocuSign / Adobe Sign.</w:t>
       </w:r>
     </w:p>
     <w:tbl>

</xml_diff>